<commit_message>
Add new art; Update renders
</commit_message>
<xml_diff>
--- a/FIE/FIE Strange Tales.docx
+++ b/FIE/FIE Strange Tales.docx
@@ -10,7 +10,6 @@
           <w:docPartUnique/>
         </w:docPartObj>
       </w:sdtPr>
-      <w:sdtEndPr/>
       <w:sdtContent>
         <w:p/>
         <w:p>
@@ -107,7 +106,6 @@
                                     <w:calendar w:val="gregorian"/>
                                   </w:date>
                                 </w:sdtPr>
-                                <w:sdtEndPr/>
                                 <w:sdtContent>
                                   <w:p>
                                     <w:pPr>
@@ -388,7 +386,6 @@
                                   <w:dataBinding w:prefixMappings="xmlns:ns0='http://purl.org/dc/elements/1.1/' xmlns:ns1='http://schemas.openxmlformats.org/package/2006/metadata/core-properties' " w:xpath="/ns1:coreProperties[1]/ns0:creator[1]" w:storeItemID="{6C3C8BC8-F283-45AE-878A-BAB7291924A1}"/>
                                   <w:text/>
                                 </w:sdtPr>
-                                <w:sdtEndPr/>
                                 <w:sdtContent>
                                   <w:p>
                                     <w:pPr>
@@ -441,7 +438,6 @@
                                     <w:dataBinding w:prefixMappings="xmlns:ns0='http://schemas.openxmlformats.org/officeDocument/2006/extended-properties' " w:xpath="/ns0:Properties[1]/ns0:Company[1]" w:storeItemID="{6668398D-A668-4E3E-A5EB-62B293D839F1}"/>
                                     <w:text/>
                                   </w:sdtPr>
-                                  <w:sdtEndPr/>
                                   <w:sdtContent>
                                     <w:r>
                                       <w:rPr>
@@ -481,7 +477,6 @@
                                     <w:dataBinding w:prefixMappings="xmlns:ns0='http://schemas.microsoft.com/office/2006/coverPageProps' " w:xpath="/ns0:CoverPageProperties[1]/ns0:CompanyAddress[1]" w:storeItemID="{55AF091B-3C7A-41E3-B477-F2FDAA23CFDA}"/>
                                     <w:text/>
                                   </w:sdtPr>
-                                  <w:sdtEndPr/>
                                   <w:sdtContent>
                                     <w:r>
                                       <w:rPr>
@@ -765,7 +760,6 @@
                                     <w:dataBinding w:prefixMappings="xmlns:ns0='http://purl.org/dc/elements/1.1/' xmlns:ns1='http://schemas.openxmlformats.org/package/2006/metadata/core-properties' " w:xpath="/ns1:coreProperties[1]/ns0:title[1]" w:storeItemID="{6C3C8BC8-F283-45AE-878A-BAB7291924A1}"/>
                                     <w:text w:multiLine="1"/>
                                   </w:sdtPr>
-                                  <w:sdtEndPr/>
                                   <w:sdtContent>
                                     <w:r>
                                       <w:rPr>
@@ -810,7 +804,6 @@
                                   <w:dataBinding w:prefixMappings="xmlns:ns0='http://purl.org/dc/elements/1.1/' xmlns:ns1='http://schemas.openxmlformats.org/package/2006/metadata/core-properties' " w:xpath="/ns1:coreProperties[1]/ns0:subject[1]" w:storeItemID="{6C3C8BC8-F283-45AE-878A-BAB7291924A1}"/>
                                   <w:text/>
                                 </w:sdtPr>
-                                <w:sdtEndPr/>
                                 <w:sdtContent>
                                   <w:p>
                                     <w:pPr>
@@ -1150,7 +1143,6 @@
           <w:docPartUnique/>
         </w:docPartObj>
       </w:sdtPr>
-      <w:sdtEndPr/>
       <w:sdtContent>
         <w:p>
           <w:pPr>
@@ -27608,9 +27600,16 @@
         </w:rPr>
         <w:t>Эпоха Первых (Ea)</w:t>
       </w:r>
-      <w:r>
-        <w:br/>
-      </w:r>
+    </w:p>
+    <w:p>
+      <w:pPr>
+        <w:pStyle w:val="ListParagraph"/>
+        <w:rPr>
+          <w:b/>
+          <w:bCs/>
+          <w:lang w:val="ru-RU"/>
+        </w:rPr>
+      </w:pPr>
       <w:r>
         <w:rPr>
           <w:lang w:val="ru-RU"/>
@@ -27636,6 +27635,9 @@
         <w:t>Эра Рассвета (Ea-1)</w:t>
       </w:r>
       <w:r>
+        <w:rPr>
+          <w:lang w:val="ru-RU"/>
+        </w:rPr>
         <w:br/>
       </w:r>
       <w:r>
@@ -27678,6 +27680,9 @@
         <w:t>Эра Сада (Ea-2)</w:t>
       </w:r>
       <w:r>
+        <w:rPr>
+          <w:lang w:val="ru-RU"/>
+        </w:rPr>
         <w:br/>
       </w:r>
       <w:r>
@@ -27735,6 +27740,9 @@
         <w:t>Эра Падения (Ea-3)</w:t>
       </w:r>
       <w:r>
+        <w:rPr>
+          <w:lang w:val="ru-RU"/>
+        </w:rPr>
         <w:br/>
       </w:r>
       <w:r>
@@ -27802,9 +27810,16 @@
         </w:rPr>
         <w:t>Эпоха Пришедших Следом (Eb)</w:t>
       </w:r>
-      <w:r>
-        <w:br/>
-      </w:r>
+    </w:p>
+    <w:p>
+      <w:pPr>
+        <w:pStyle w:val="ListParagraph"/>
+        <w:rPr>
+          <w:b/>
+          <w:bCs/>
+          <w:lang w:val="ru-RU"/>
+        </w:rPr>
+      </w:pPr>
       <w:r>
         <w:rPr>
           <w:lang w:val="ru-RU"/>
@@ -27829,18 +27844,48 @@
         </w:rPr>
         <w:t>Эра Колонизации (Eb-1, приблизительно 10000 стандартных лет)</w:t>
       </w:r>
-      <w:r>
-        <w:br/>
-      </w:r>
-      <w:r>
-        <w:rPr>
-          <w:lang w:val="ru-RU"/>
-        </w:rPr>
-        <w:t>Из-за стремительного технологического развития ранних цивилизаций этой эпохи, первая эра была пронизана экспансией и междоусобными войнами разумных рас. Это достаточно быстро вывело из гонки за первенство множество видов, оставив всего горстку имеющих радикальное преимущество над остальными.</w:t>
-      </w:r>
-      <w:r>
-        <w:br/>
-      </w:r>
+    </w:p>
+    <w:p>
+      <w:pPr>
+        <w:pStyle w:val="ListParagraph"/>
+        <w:ind w:left="1440"/>
+        <w:rPr>
+          <w:lang w:val="ru-RU"/>
+        </w:rPr>
+      </w:pPr>
+      <w:r>
+        <w:rPr>
+          <w:lang w:val="ru-RU"/>
+        </w:rPr>
+        <w:t>Из-за стремительного технологического развития ранних цивилизаций этой эпохи</w:t>
+      </w:r>
+      <w:r>
+        <w:rPr>
+          <w:lang w:val="ru-RU"/>
+        </w:rPr>
+        <w:t xml:space="preserve"> первая эра была пронизана экспансией и междоусобными войнами разумных рас. Это достаточно быстро вывело из гонки за первенство множество видов, оставив всего горстку имеющих радикальное преимущество </w:t>
+      </w:r>
+      <w:r>
+        <w:rPr>
+          <w:lang w:val="ru-RU"/>
+        </w:rPr>
+        <w:t>перед остальными</w:t>
+      </w:r>
+      <w:r>
+        <w:rPr>
+          <w:lang w:val="ru-RU"/>
+        </w:rPr>
+        <w:t>.</w:t>
+      </w:r>
+    </w:p>
+    <w:p>
+      <w:pPr>
+        <w:pStyle w:val="ListParagraph"/>
+        <w:ind w:left="1440"/>
+        <w:rPr>
+          <w:lang w:val="ru-RU"/>
+        </w:rPr>
+      </w:pPr>
       <w:r>
         <w:rPr>
           <w:lang w:val="ru-RU"/>
@@ -27885,6 +27930,9 @@
       <w:pPr>
         <w:pStyle w:val="ListParagraph"/>
         <w:ind w:left="1440"/>
+        <w:rPr>
+          <w:lang w:val="ru-RU"/>
+        </w:rPr>
       </w:pPr>
       <w:r>
         <w:rPr>
@@ -27919,9 +27967,14 @@
         </w:rPr>
         <w:t>Эпоха Гармонии (Э / Ec)</w:t>
       </w:r>
-      <w:r>
-        <w:br/>
-      </w:r>
+    </w:p>
+    <w:p>
+      <w:pPr>
+        <w:pStyle w:val="ListParagraph"/>
+        <w:rPr>
+          <w:lang w:val="ru-RU"/>
+        </w:rPr>
+      </w:pPr>
       <w:r>
         <w:rPr>
           <w:lang w:val="ru-RU"/>
@@ -27940,7 +27993,19 @@
         <w:rPr>
           <w:lang w:val="ru-RU"/>
         </w:rPr>
-        <w:t>Миры здесь не были соединены напрямую пространством, и невозможно было перелететь из одного в другой, при этом не потерявшись в пустоте. Вместо этого они были соединены тоннелями, что создавали собой паутину, похожую на древо, где каждый мир был всего лишь одним из множества листков. Из-за такой природы, миры часто повторяли черты один другого, порождая “копии” или “воплощения” одного и того же в разных реальностях.</w:t>
+        <w:t xml:space="preserve">Миры здесь не были соединены напрямую пространством, и невозможно было перелететь из одного в другой, при этом не потерявшись в пустоте. Вместо этого они были соединены тоннелями, что создавали собой паутину, похожую на древо, где каждый мир был всего лишь одним из множества листков. </w:t>
+      </w:r>
+      <w:r>
+        <w:rPr>
+          <w:lang w:val="ru-RU"/>
+        </w:rPr>
+        <w:t>Из-за такой природы</w:t>
+      </w:r>
+      <w:r>
+        <w:rPr>
+          <w:lang w:val="ru-RU"/>
+        </w:rPr>
+        <w:t xml:space="preserve"> миры часто повторяли черты один другого, порождая “копии” или “воплощения” одного и того же в разных реальностях.</w:t>
       </w:r>
     </w:p>
     <w:p>
@@ -27974,14 +28039,26 @@
         </w:rPr>
         <w:t>Эра Творения (Э1, приблизительно 1000 лет)</w:t>
       </w:r>
-      <w:r>
-        <w:br/>
-      </w:r>
-      <w:r>
-        <w:rPr>
-          <w:lang w:val="ru-RU"/>
-        </w:rPr>
-        <w:t>По аналогии с остальной галактикой, жизнь здесь сформировалась быстро под влиянием плетения Лилит, что тут получила название “огня творения”. Однако формы, что она здесь принимала, часто были уникальными от остальной галактики, поскольку основой для создания Гармонии послужила уникальная ветка Древа Памяти, что здесь получила название “песков времени”.</w:t>
+    </w:p>
+    <w:p>
+      <w:pPr>
+        <w:pStyle w:val="ListParagraph"/>
+        <w:ind w:left="1440"/>
+        <w:rPr>
+          <w:lang w:val="ru-RU"/>
+        </w:rPr>
+      </w:pPr>
+      <w:r>
+        <w:rPr>
+          <w:lang w:val="ru-RU"/>
+        </w:rPr>
+        <w:t>По аналогии с остальной галактикой</w:t>
+      </w:r>
+      <w:r>
+        <w:rPr>
+          <w:lang w:val="ru-RU"/>
+        </w:rPr>
+        <w:t xml:space="preserve"> жизнь здесь сформировалась быстро под влиянием плетения Лилит, что тут получила название “огня творения”. Однако формы, что она здесь принимала, часто были уникальными от остальной галактики, поскольку основой для создания Гармонии послужила уникальная ветка Древа Памяти, что здесь получила название “песков времени”.</w:t>
       </w:r>
     </w:p>
     <w:p>
@@ -28225,7 +28302,19 @@
         <w:rPr>
           <w:lang w:val="ru-RU"/>
         </w:rPr>
-        <w:t>Время спокойствия и процветания, навязанного мира, что усыпил пони на долгое тысячелетие. Селестия наконец смогла закончить работу своего наставника, что привела к сну, что продлился слишком долго.</w:t>
+        <w:t xml:space="preserve">Время спокойствия и процветания, навязанного мира, что усыпил пони на долгое тысячелетие. Селестия наконец смогла закончить работу своего наставника, что привела </w:t>
+      </w:r>
+      <w:r>
+        <w:rPr>
+          <w:lang w:val="ru-RU"/>
+        </w:rPr>
+        <w:t>ко сну</w:t>
+      </w:r>
+      <w:r>
+        <w:rPr>
+          <w:lang w:val="ru-RU"/>
+        </w:rPr>
+        <w:t>, что продлился слишком долго.</w:t>
       </w:r>
     </w:p>
     <w:p>
@@ -28256,7 +28345,19 @@
           <w:lang w:val="ru-RU"/>
         </w:rPr>
         <w:lastRenderedPageBreak/>
-        <w:t xml:space="preserve">Появившись в конце Э4, она быстро завоевала себе место как важной принцессы Эквестрии, но настоящей проверкой для неё стало восстание, ведомое Фолленстар, и второе вторжение теней, что почти закончилось концом света. Но вместе Звезда и Твайлайт смогли развязать тайну мира и спасли его, при этом версия Искорки из другой реальности заняла пустующее место принцессы Времени. Сама Фолленстар оставила свою позицию принцессы Разрушения в пользу Мунлайт, так же, как это сделала Селестия ранее. </w:t>
+        <w:t xml:space="preserve">Появившись в конце Э4, она быстро завоевала себе место как важной принцессы Эквестрии, но настоящей проверкой для неё стало восстание, ведомое Фолленстар, и второе вторжение теней, что почти закончилось концом света. Но вместе Звезда и Твайлайт смогли развязать тайну мира и спасли его, при этом версия Искорки из другой реальности заняла пустующее место принцессы Времени. Сама Фолленстар оставила свою позицию принцессы Разрушения в пользу </w:t>
+      </w:r>
+      <w:r>
+        <w:rPr>
+          <w:lang w:val="ru-RU"/>
+        </w:rPr>
+        <w:t>Мунлайт так же, как</w:t>
+      </w:r>
+      <w:r>
+        <w:rPr>
+          <w:lang w:val="ru-RU"/>
+        </w:rPr>
+        <w:t xml:space="preserve"> это сделала Селестия ранее. </w:t>
       </w:r>
     </w:p>
     <w:p>

</xml_diff>